<commit_message>
Dokumentation und Uebergabe auf den neuen Namen und den heutigen Stand
Die Gesamtdokumentation traegt den neuen Namen, die .docx ist neu erzeugt.
Die Uebergabe haelt Abschnitt I und J als erledigt fest - damit steht der
Stand, den Simon sich ansehen sollte.

Vier neue Fallstricke: eine StackPane zentriert ihre Kinder und laesst
einen zu grossen Rahmen auf beiden Seiten hinausragen; mvn clean scheitert,
solange das gebaute Paket noch laeuft; MainWindowTitle des gestarteten
Prozesses ist leer, weil der jpackage-Starter selbst kein Fenster hat -
das heisst nicht, dass die Titelleiste leer ist.

Co-Authored-By: Claude Opus 5 <noreply@anthropic.com>
</commit_message>
<xml_diff>
--- a/GKVTransmitter/Information/GKVTransmitter_Dokumentation.docx
+++ b/GKVTransmitter/Information/GKVTransmitter_Dokumentation.docx
@@ -10,7 +10,7 @@
         <w:rPr>
           <w:lang w:val="de-DE"/>
         </w:rPr>
-        <w:t xml:space="preserve">GKVTransmitter</w:t>
+        <w:t xml:space="preserve">GKV-Abrechnung</w:t>
       </w:r>
     </w:p>
     <w:p>
@@ -141,7 +141,7 @@
         <w:rPr>
           <w:lang w:val="de-DE"/>
         </w:rPr>
-        <w:t xml:space="preserve">Der GKVTransmitter unterstützt die Abrechnung erbrachter Leistungen mit gesetzlichen Krankenkassen. Leistungen für gesetzlich Versicherte werden nicht mit den Versicherten abgerechnet, sondern mit deren Krankenkasse — und zwar als strukturierte Datenlieferung im DTA-Format, nicht als Rechnung auf Papier.</w:t>
+        <w:t xml:space="preserve">Die GKV-Abrechnung unterstützt die Abrechnung erbrachter Leistungen mit gesetzlichen Krankenkassen. Leistungen für gesetzlich Versicherte werden nicht mit den Versicherten abgerechnet, sondern mit deren Krankenkasse — und zwar als strukturierte Datenlieferung im DTA-Format, nicht als Rechnung auf Papier.</w:t>
       </w:r>
     </w:p>
     <w:p>
@@ -287,7 +287,7 @@
           <w:rStyle w:val="VerbatimChar"/>
           <w:lang w:val="de-DE"/>
         </w:rPr>
-        <w:t xml:space="preserve">GKVTransmitter.exe</w:t>
+        <w:t xml:space="preserve">GKV-Abrechnung.exe</w:t>
       </w:r>
       <w:r>
         <w:rPr>
@@ -407,7 +407,7 @@
                 <w:rStyle w:val="VerbatimChar"/>
                 <w:lang w:val="de-DE"/>
               </w:rPr>
-              <w:t xml:space="preserve">%LOCALAPPDATA%\GKVTransmitter</w:t>
+              <w:t xml:space="preserve">%LOCALAPPDATA%GKV-Abrechnung</w:t>
             </w:r>
           </w:p>
         </w:tc>
@@ -438,7 +438,7 @@
                 <w:rStyle w:val="VerbatimChar"/>
                 <w:lang w:val="de-DE"/>
               </w:rPr>
-              <w:t xml:space="preserve">~/Library/Application Support/GKVTransmitter</w:t>
+              <w:t xml:space="preserve">~/Library/Application Support/GKV-Abrechnung</w:t>
             </w:r>
           </w:p>
         </w:tc>
@@ -729,7 +729,7 @@
           <w:rStyle w:val="VerbatimChar"/>
           <w:lang w:val="de-DE"/>
         </w:rPr>
-        <w:t xml:space="preserve">GKVTransmitter.exe</w:t>
+        <w:t xml:space="preserve">GKV-Abrechnung.exe</w:t>
       </w:r>
     </w:p>
     <w:bookmarkEnd w:id="13"/>
@@ -3782,7 +3782,7 @@
           <w:rStyle w:val="VerbatimChar"/>
           <w:lang w:val="de-DE"/>
         </w:rPr>
-        <w:t xml:space="preserve">gkv-ui/target/paket/GKVTransmitter/</w:t>
+        <w:t xml:space="preserve">gkv-ui/target/paket/GKV-Abrechnung/</w:t>
       </w:r>
       <w:r>
         <w:rPr>

</xml_diff>

<commit_message>
Klargestellt: das Zertifikat gilt je IK, nicht je Kasse
Simons Rueckfrage: "muss das nicht pro Kasse entrichtet werden?" Nein - und
dass die Frage aufkam, heisst, dass der Text es nicht hergab.

Nachgeprueft beim ITSG Trust Center: das Zertifikat wird auf das eigene IK
ausgestellt und gilt fuer den Datenaustausch mit allen Datenannahmestellen.
Die oeffentlichen Schluessel der Empfaenger kommen als Schluesselliste
(annahme-sha256.key) kostenlos mit. Keine Gebuehr je Kasse, keine je Lieferung.

Steht jetzt in der Dokumentation, in der Uebergabe und im Skill kassen-versand.

Co-Authored-By: Claude Opus 5 <noreply@anthropic.com>
</commit_message>
<xml_diff>
--- a/GKVTransmitter/Information/GKVTransmitter_Dokumentation.docx
+++ b/GKVTransmitter/Information/GKVTransmitter_Dokumentation.docx
@@ -5559,7 +5559,97 @@
     </w:p>
     <w:p>
       <w:pPr>
-        <w:pStyle w:val="BodyText"/>
+        <w:pStyle w:val="BlockText"/>
+      </w:pPr>
+      <w:r>
+        <w:rPr>
+          <w:b/>
+          <w:bCs/>
+          <w:lang w:val="de-DE"/>
+        </w:rPr>
+        <w:t xml:space="preserve">Der Betrag fällt einmal an, nicht je Kasse.</w:t>
+      </w:r>
+      <w:r>
+        <w:rPr>
+          <w:lang w:val="de-DE"/>
+        </w:rPr>
+        <w:t xml:space="preserve"> </w:t>
+      </w:r>
+      <w:r>
+        <w:rPr>
+          <w:lang w:val="de-DE"/>
+        </w:rPr>
+        <w:t xml:space="preserve">Das Zertifikat wird auf das</w:t>
+      </w:r>
+      <w:r>
+        <w:rPr>
+          <w:lang w:val="de-DE"/>
+        </w:rPr>
+        <w:t xml:space="preserve"> </w:t>
+      </w:r>
+      <w:r>
+        <w:rPr>
+          <w:b/>
+          <w:bCs/>
+          <w:lang w:val="de-DE"/>
+        </w:rPr>
+        <w:t xml:space="preserve">eigene IK</w:t>
+      </w:r>
+      <w:r>
+        <w:rPr>
+          <w:lang w:val="de-DE"/>
+        </w:rPr>
+        <w:t xml:space="preserve"> </w:t>
+      </w:r>
+      <w:r>
+        <w:rPr>
+          <w:lang w:val="de-DE"/>
+        </w:rPr>
+        <w:t xml:space="preserve">ausgestellt und gilt für den Datenaustausch mit</w:t>
+      </w:r>
+      <w:r>
+        <w:rPr>
+          <w:lang w:val="de-DE"/>
+        </w:rPr>
+        <w:t xml:space="preserve"> </w:t>
+      </w:r>
+      <w:r>
+        <w:rPr>
+          <w:b/>
+          <w:bCs/>
+          <w:lang w:val="de-DE"/>
+        </w:rPr>
+        <w:t xml:space="preserve">allen</w:t>
+      </w:r>
+      <w:r>
+        <w:rPr>
+          <w:lang w:val="de-DE"/>
+        </w:rPr>
+        <w:t xml:space="preserve"> </w:t>
+      </w:r>
+      <w:r>
+        <w:rPr>
+          <w:lang w:val="de-DE"/>
+        </w:rPr>
+        <w:t xml:space="preserve">Datenannahmestellen. Zum Verschlüsseln wird der öffentliche Schlüssel des jeweiligen Empfängers gebraucht — den liefert das Trust Center als Schlüsselliste (</w:t>
+      </w:r>
+      <w:r>
+        <w:rPr>
+          <w:rStyle w:val="VerbatimChar"/>
+          <w:lang w:val="de-DE"/>
+        </w:rPr>
+        <w:t xml:space="preserve">annahme-sha256.key</w:t>
+      </w:r>
+      <w:r>
+        <w:rPr>
+          <w:lang w:val="de-DE"/>
+        </w:rPr>
+        <w:t xml:space="preserve">) zusammen mit dem Zertifikat mit, ohne weitere Kosten. Es gibt also weder eine Gebühr je Kasse noch eine je Lieferung.</w:t>
+      </w:r>
+    </w:p>
+    <w:p>
+      <w:pPr>
+        <w:pStyle w:val="FirstParagraph"/>
       </w:pPr>
       <w:r>
         <w:rPr>

</xml_diff>